<commit_message>
v12.9 - suivi du demarchage commercial : journal des contacts, resultats et motifs de refus, pipeline, session d'appels (migration v71)
</commit_message>
<xml_diff>
--- a/docs/pack-commercial/ARGUMENTAIRE-DEMARCHAGE.docx
+++ b/docs/pack-commercial/ARGUMENTAIRE-DEMARCHAGE.docx
@@ -91,7 +91,7 @@
           <w:sz w:val="20"/>
           <w:szCs w:val="20"/>
         </w:rPr>
-        <w:t xml:space="preserve">Signal d'achat n°1 : le patron fait l'administratif le soir et le week-end, ou la secrétaire est débordée / absente.</w:t>
+        <w:t>Signal d'achat n°1 : le patron fait l'administratif le soir et le week-end, ou la personne qui gère l'administratif est débordée, et des dossiers d'assurance traînent depuis des mois.</w:t>
       </w:r>
     </w:p>
     <w:p>
@@ -147,7 +147,7 @@
           <w:sz w:val="20"/>
           <w:szCs w:val="20"/>
         </w:rPr>
-        <w:t xml:space="preserve">« Nous équipons les carrosseries d'une appli qui lit le rapport d'expertise et génère toute la paperasse — devis, facture, ordre de réparation, cession de créance — et, si vous le souhaitez, une secrétaire dédiée s'occupe des relances assurances et des encaissements à votre place. Vous ne touchez plus un papier : vous réparez, l'argent rentre. La démonstration prend 15 minutes, avec un de VOS rapports d'expertise. »</w:t>
+        <w:t>« Nous équipons les carrosseries d'une appli qui lit le rapport d'expertise et génère toute la paperasse — devis, facture, ordre de réparation, cession de créance — et, si vous le souhaitez, un chargé de mission spécialisé dans les litiges reprend vos dossiers bloqués — impayés, litiges, dossiers qui traînent — et appelle l'assurance, l'expert, le client jusqu'à ce que l'argent rentre. La démonstration prend 15 minutes, avec un de VOS rapports d'expertise. »</w:t>
       </w:r>
     </w:p>
     <w:p>
@@ -454,7 +454,7 @@
                 <w:sz w:val="19"/>
                 <w:szCs w:val="19"/>
               </w:rPr>
-              <w:t xml:space="preserve">« Ce n'est pas juste un logiciel : une secrétaire dédiée, formée aux sinistres, traite vos dossiers chaque jour. Vous l'avez au téléphone. »</w:t>
+              <w:t>« Ce n'est pas juste un logiciel : un chargé de mission spécialisé dans les litiges reprend vos dossiers compliqués et les fait aboutir. Vous l'avez au téléphone. »</w:t>
             </w:r>
           </w:p>
         </w:tc>
@@ -520,7 +520,7 @@
                 <w:sz w:val="19"/>
                 <w:szCs w:val="19"/>
               </w:rPr>
-              <w:t xml:space="preserve">« Pour moins cher qu'un mi-temps chargé, sans contrat de travail, sans absence à gérer, et ça s'arrête ou s'ajuste chaque mois. »</w:t>
+              <w:t>« Un seul dossier de 2 000 € débloqué paie plusieurs mois d'Adhésion Service — sans embauche, sans absence à gérer, et ça s'ajuste chaque mois. »</w:t>
             </w:r>
           </w:p>
         </w:tc>
@@ -1109,7 +1109,7 @@
                 <w:sz w:val="19"/>
                 <w:szCs w:val="19"/>
               </w:rPr>
-              <w:t xml:space="preserve">« J'ai déjà une secrétaire »</w:t>
+              <w:t>« J'ai déjà quelqu'un pour l'administratif »</w:t>
             </w:r>
           </w:p>
         </w:tc>
@@ -1206,7 +1206,7 @@
                 <w:sz w:val="19"/>
                 <w:szCs w:val="19"/>
               </w:rPr>
-              <w:t xml:space="preserve">« Comptez ce que coûte 1 h de paperasse par dossier × vos dossiers par mois, plus les factures payées à 60 jours. Le forfait Confort revient à 39 € de l'heure, tout compris — moins qu'un intérimaire, appli incluse. »</w:t>
+              <w:t>« Comptez ce que coûte 1 h de paperasse par dossier × vos dossiers par mois, plus les factures payées à 60 jours. Le forfait Adhésion Service Premium revient à 39 € de l'heure, tout compris — moins qu'un intérimaire, appli incluse. »</w:t>
             </w:r>
           </w:p>
         </w:tc>
@@ -1272,7 +1272,7 @@
                 <w:sz w:val="19"/>
                 <w:szCs w:val="19"/>
               </w:rPr>
-              <w:t xml:space="preserve">« Justement non : vous n'avez rien à apprendre si vous ne voulez pas. La secrétaire s'en sert pour vous. Vous, vous recevez un point clair et vos documents prêts à signer. »</w:t>
+              <w:t>« Justement non : vous n'avez rien à apprendre si vous ne voulez pas. Le chargé de mission s'en sert pour faire avancer vos dossiers bloqués. Vous, vous recevez un point clair et vos documents prêts à signer. »</w:t>
             </w:r>
           </w:p>
         </w:tc>
@@ -1470,7 +1470,7 @@
                 <w:sz w:val="19"/>
                 <w:szCs w:val="19"/>
               </w:rPr>
-              <w:t xml:space="preserve">« C'est possible : 79 € par mois, sans engagement. Beaucoup commencent comme ça et ajoutent des heures de secrétariat au premier coup de bourre. »</w:t>
+              <w:t>« C'est possible : 79 € par mois, sans engagement. Beaucoup commencent comme ça et ajoutent des heures d'Adhésion Service au premier coup de bourre. »</w:t>
             </w:r>
           </w:p>
         </w:tc>
@@ -1550,7 +1550,7 @@
           <w:sz w:val="20"/>
           <w:szCs w:val="20"/>
         </w:rPr>
-        <w:t xml:space="preserve">3 min — Grille des formules (montrer Confort en premier), mise en service offerte si engagement 12 mois.</w:t>
+        <w:t>3 min — Grille des formules (montrer Adhésion Service Premium en premier), mise en service offerte si engagement 12 mois.</w:t>
       </w:r>
     </w:p>
     <w:p>
@@ -1671,6 +1671,8 @@
     <w:sectPr>
       <w:headerReference w:type="default" r:id="rId7"/>
       <w:footerReference w:type="default" r:id="rId8"/>
+      <w:headerReference w:type="first" r:id="rId10"/>
+      <w:footerReference w:type="first" r:id="rId11"/>
       <w:pgSz w:w="11906" w:h="16838" w:orient="portrait"/>
       <w:pgMar w:top="1000" w:right="1000" w:bottom="900" w:left="1000" w:header="708" w:footer="708" w:gutter="0"/>
       <w:pgNumType/>
@@ -1772,6 +1774,16 @@
       <w:fldChar w:fldCharType="separate"/>
       <w:fldChar w:fldCharType="end"/>
     </w:r>
+  </w:p>
+</w:ftr>
+</file>
+
+<file path=word/footer2.xml><?xml version="1.0" encoding="utf-8"?>
+<w:ftr xmlns:m="http://schemas.openxmlformats.org/officeDocument/2006/math" xmlns:mc="http://schemas.openxmlformats.org/markup-compatibility/2006" xmlns:mo="http://schemas.microsoft.com/office/mac/office/2008/main" xmlns:mv="urn:schemas-microsoft-com:mac:vml" xmlns:o="urn:schemas-microsoft-com:office:office" xmlns:r="http://schemas.openxmlformats.org/officeDocument/2006/relationships" xmlns:v="urn:schemas-microsoft-com:vml" xmlns:w10="urn:schemas-microsoft-com:office:word" xmlns:w14="http://schemas.microsoft.com/office/word/2010/wordml" xmlns:w="http://schemas.openxmlformats.org/wordprocessingml/2006/main" xmlns:wne="http://schemas.microsoft.com/office/word/2006/wordml" xmlns:wp14="http://schemas.microsoft.com/office/word/2010/wordprocessingDrawing" xmlns:wp="http://schemas.openxmlformats.org/drawingml/2006/wordprocessingDrawing" xmlns:wpc="http://schemas.microsoft.com/office/word/2010/wordprocessingCanvas" xmlns:wpg="http://schemas.microsoft.com/office/word/2010/wordprocessingGroup" xmlns:wpi="http://schemas.microsoft.com/office/word/2010/wordprocessingInk" xmlns:wps="http://schemas.microsoft.com/office/word/2010/wordprocessingShape" mc:Ignorable="w14 wp14">
+  <w:p>
+    <w:pPr>
+      <w:pStyle w:val="Footer"/>
+    </w:pPr>
   </w:p>
 </w:ftr>
 </file>
@@ -1978,6 +1990,16 @@
         <w:bottom w:val="single" w:color="7C3AED" w:sz="8" w:space="1"/>
       </w:pBdr>
       <w:spacing w:after="0" w:before="60"/>
+    </w:pPr>
+  </w:p>
+</w:hdr>
+</file>
+
+<file path=word/header2.xml><?xml version="1.0" encoding="utf-8"?>
+<w:hdr xmlns:m="http://schemas.openxmlformats.org/officeDocument/2006/math" xmlns:mc="http://schemas.openxmlformats.org/markup-compatibility/2006" xmlns:mo="http://schemas.microsoft.com/office/mac/office/2008/main" xmlns:mv="urn:schemas-microsoft-com:mac:vml" xmlns:o="urn:schemas-microsoft-com:office:office" xmlns:r="http://schemas.openxmlformats.org/officeDocument/2006/relationships" xmlns:v="urn:schemas-microsoft-com:vml" xmlns:w10="urn:schemas-microsoft-com:office:word" xmlns:w14="http://schemas.microsoft.com/office/word/2010/wordml" xmlns:w="http://schemas.openxmlformats.org/wordprocessingml/2006/main" xmlns:wne="http://schemas.microsoft.com/office/word/2006/wordml" xmlns:wp14="http://schemas.microsoft.com/office/word/2010/wordprocessingDrawing" xmlns:wp="http://schemas.openxmlformats.org/drawingml/2006/wordprocessingDrawing" xmlns:wpc="http://schemas.microsoft.com/office/word/2010/wordprocessingCanvas" xmlns:wpg="http://schemas.microsoft.com/office/word/2010/wordprocessingGroup" xmlns:wpi="http://schemas.microsoft.com/office/word/2010/wordprocessingInk" xmlns:wps="http://schemas.microsoft.com/office/word/2010/wordprocessingShape" mc:Ignorable="w14 wp14">
+  <w:p>
+    <w:pPr>
+      <w:pStyle w:val="Header"/>
     </w:pPr>
   </w:p>
 </w:hdr>

</xml_diff>

<commit_message>
v13.35 — Recherche rapide d'un dossier sur le tableau de bord + page d'accueil en version mobile (menu burger, carrousels, barre d'action) + v13.33/v13.34
</commit_message>
<xml_diff>
--- a/docs/pack-commercial/ARGUMENTAIRE-DEMARCHAGE.docx
+++ b/docs/pack-commercial/ARGUMENTAIRE-DEMARCHAGE.docx
@@ -147,7 +147,7 @@
           <w:sz w:val="20"/>
           <w:szCs w:val="20"/>
         </w:rPr>
-        <w:t>« Nous équipons les carrosseries d'une appli qui lit le rapport d'expertise et génère toute la paperasse — devis, facture, ordre de réparation, cession de créance — et, si vous le souhaitez, un chargé de mission spécialisé dans les litiges reprend vos dossiers bloqués — impayés, litiges, dossiers qui traînent — et appelle l'assurance, l'expert, le client jusqu'à ce que l'argent rentre. La démonstration prend 15 minutes, avec un de VOS rapports d'expertise. »</w:t>
+        <w:t xml:space="preserve">« Nous équipons les carrosseries d'une appli qui lit le rapport d'expertise et génère toute la paperasse — devis, facture, ordre de réparation, cession de créance — et, si vous le souhaitez, un chargé de mission spécialisé dans les litiges reprend vos dossiers bloqués — impayés, litiges, dossiers qui traînent — et appelle l'assurance, l'expert, le client jusqu'à ce que l'argent rentre. La démonstration prend 15 minutes, sur un compte de démonstration. »</w:t>
       </w:r>
     </w:p>
     <w:p>
@@ -698,7 +698,7 @@
                 <w:sz w:val="19"/>
                 <w:szCs w:val="19"/>
               </w:rPr>
-              <w:t xml:space="preserve">« Bonjour, [Prénom Nom], de IDEA FORMA. Je travaille avec des carrosseries sur la gestion des dossiers sinistres. C'est bien vous qui gérez les dossiers d'assurance ? »</w:t>
+              <w:t xml:space="preserve">« Bonjour, [Prénom Nom], de MY EASY AUTO. Je travaille avec des carrosseries sur la gestion des dossiers sinistres. C'est bien vous qui gérez les dossiers d'assurance ? »</w:t>
             </w:r>
           </w:p>
         </w:tc>
@@ -896,7 +896,7 @@
                 <w:sz w:val="19"/>
                 <w:szCs w:val="19"/>
               </w:rPr>
-              <w:t xml:space="preserve">« Je vous montre en 15 minutes, sur UN de vos rapports d'expertise, comment le dossier se remplit tout seul. Mardi 12 h 30 ou jeudi 18 h, qu'est-ce qui vous arrange ? »</w:t>
+              <w:t xml:space="preserve">« Je vous montre en 15 minutes comment un dossier se remplit tout seul à partir d'un rapport d'expertise. Mardi 12 h 30 ou jeudi 18 h, qu'est-ce qui vous arrange ? »</w:t>
             </w:r>
           </w:p>
         </w:tc>
@@ -1140,7 +1140,7 @@
                 <w:sz w:val="19"/>
                 <w:szCs w:val="19"/>
               </w:rPr>
-              <w:t xml:space="preserve">« Parfait — l'appli lui fait gagner la moitié de son temps (zéro ressaisie), et le forfait peut ne couvrir que les débordements : congés, pics d'activité, relances. On complète, on ne remplace pas. »</w:t>
+              <w:t xml:space="preserve">« Parfait — l'appli lui fait gagner la moitié de son temps (zéro ressaisie), et le chargé de mission ne prend que les dossiers qui bloquent : impayés, litiges, dossiers qui traînent. »</w:t>
             </w:r>
           </w:p>
         </w:tc>
@@ -1206,7 +1206,7 @@
                 <w:sz w:val="19"/>
                 <w:szCs w:val="19"/>
               </w:rPr>
-              <w:t>« Comptez ce que coûte 1 h de paperasse par dossier × vos dossiers par mois, plus les factures payées à 60 jours. Le forfait Adhésion Service Premium revient à 39 € de l'heure, tout compris — moins qu'un intérimaire, appli incluse. »</w:t>
+              <w:t xml:space="preserve">« Comptez ce que coûte 1 h de paperasse par dossier × vos dossiers par mois, plus les factures payées à 60 jours. Le forfait Adhésion Service Premium revient à 39 € de l'heure de chargé de mission, sans charges ni embauche. »</w:t>
             </w:r>
           </w:p>
         </w:tc>
@@ -1470,7 +1470,7 @@
                 <w:sz w:val="19"/>
                 <w:szCs w:val="19"/>
               </w:rPr>
-              <w:t>« C'est possible : 79 € par mois, sans engagement. Beaucoup commencent comme ça et ajoutent des heures d'Adhésion Service au premier coup de bourre. »</w:t>
+              <w:t xml:space="preserve">« C'est possible : 79 € HT par mois sans engagement, 75,05 € HT avec l'engagement 12 mois. Beaucoup commencent comme ça et ajoutent des heures d'Adhésion Service au premier coup de bourre. »</w:t>
             </w:r>
           </w:p>
         </w:tc>
@@ -1569,7 +1569,7 @@
           <w:sz w:val="20"/>
           <w:szCs w:val="20"/>
         </w:rPr>
-        <w:t xml:space="preserve">2 min — Lever la dernière objection, proposer de remplir la fiche de besoins ensemble.</w:t>
+        <w:t xml:space="preserve">2 min — Lever la dernière objection, proposer la formule et le mode de paiement.</w:t>
       </w:r>
     </w:p>
     <w:p>
@@ -1588,7 +1588,7 @@
           <w:sz w:val="20"/>
           <w:szCs w:val="20"/>
         </w:rPr>
-        <w:t xml:space="preserve">Closing : « On démarre sur quel forfait, 10 ou 20 heures ? » — puis devis envoyé le jour même.</w:t>
+        <w:t xml:space="preserve">Closing : « On démarre sur quel forfait, 10 ou 20 heures ? » — puis signature sur myeasyauto.fr/vente (contrat, CGV, CGU) et paiement de la 1re échéance ; à défaut, devis envoyé sous 24 h.</w:t>
       </w:r>
     </w:p>
     <w:p>
@@ -1665,7 +1665,7 @@
           <w:sz w:val="20"/>
           <w:szCs w:val="20"/>
         </w:rPr>
-        <w:t xml:space="preserve">Dès signature : check-list de démarrage du guide collaborateur, premier point à J+7.</w:t>
+        <w:t xml:space="preserve">Dès signature : vente déclarée sur myeasyauto.fr/vente, création du compte par l'éditeur sous 5 jours ouvrés, puis suivi à M1 et M5.</w:t>
       </w:r>
     </w:p>
     <w:sectPr>
@@ -1739,7 +1739,7 @@
         <w:sz w:val="14"/>
         <w:szCs w:val="14"/>
       </w:rPr>
-      <w:t xml:space="preserve">IDEA FORMA — 144 Avenue Charles de Gaulle, 92200 Neuilly-sur-Seine — SIRET 993 125 335 00014 — NAF 8559A — contact.ideaforma@gmail.com   ·   Page </w:t>
+      <w:t xml:space="preserve">MY EASY AUTO — 144 Avenue Charles de Gaulle, 92200 Neuilly-sur-Seine — SIRET 993 125 335 00014 — NAF 8559A — contact@myeasyauto.fr   ·   Page </w:t>
     </w:r>
     <w:r>
       <w:rPr>
@@ -1963,7 +1963,7 @@
               <w:sz w:val="18"/>
               <w:szCs w:val="18"/>
             </w:rPr>
-            <w:t xml:space="preserve">IDEA FORMA</w:t>
+            <w:t xml:space="preserve">MY EASY AUTO</w:t>
           </w:r>
         </w:p>
         <w:p>
@@ -1978,7 +1978,7 @@
               <w:sz w:val="14"/>
               <w:szCs w:val="14"/>
             </w:rPr>
-            <w:t xml:space="preserve">contact.ideaforma@gmail.com</w:t>
+            <w:t xml:space="preserve">contact@myeasyauto.fr</w:t>
           </w:r>
         </w:p>
       </w:tc>

</xml_diff>